<commit_message>
Budget: salary entered from 19/9, scenario A fitted under the cap with the hire from M3, student ARE at 10%, every expense listed
Co-Authored-By: Claude Fable 5.1 <noreply@anthropic.com>
Claude-Session: https://claude.ai/code/session_01Pijyy83JyS8bJxoVQgxwZB
</commit_message>
<xml_diff>
--- a/04-other-documents/budget.docx
+++ b/04-other-documents/budget.docx
@@ -457,13 +457,19 @@
         <w:t xml:space="preserve"> </w:t>
       </w:r>
       <w:r>
-        <w:t xml:space="preserve">larger than the top steps, so the extrapolation with a constant step of 1,049 is a lower</w:t>
-      </w:r>
-      <w:r>
-        <w:t xml:space="preserve"> </w:t>
-      </w:r>
-      <w:r>
-        <w:t xml:space="preserve">bound for 19/9 to 19/11.</w:t>
+        <w:t xml:space="preserve">larger than the top steps (the 2019 class average step was about 1,620 against about 1,010 at</w:t>
+      </w:r>
+      <w:r>
+        <w:t xml:space="preserve"> </w:t>
+      </w:r>
+      <w:r>
+        <w:t xml:space="preserve">the top), so the extrapolation with a constant step of 1,049 slightly overstates 19/9 to</w:t>
+      </w:r>
+      <w:r>
+        <w:t xml:space="preserve"> </w:t>
+      </w:r>
+      <w:r>
+        <w:t xml:space="preserve">19/11. HR’s figure will be a little lower. mySNF corrects it at award.</w:t>
       </w:r>
     </w:p>
     <w:p>
@@ -487,13 +493,13 @@
       </w:r>
     </w:p>
     <w:bookmarkEnd w:id="21"/>
-    <w:bookmarkStart w:id="22" w:name="X8dc9638c84b6812cc46cb674f94f453435f8ced"/>
+    <w:bookmarkStart w:id="22" w:name="X4f6d05dca703cd7ac0b9449a7d3b6a7a4667c86"/>
     <w:p>
       <w:pPr>
         <w:pStyle w:val="Heading3"/>
       </w:pPr>
       <w:r>
-        <w:t xml:space="preserve">The three possible entries (gross at 100%, one annuity per year from the start)</w:t>
+        <w:t xml:space="preserve">The possible entries (gross at 100%, one annuity per year from the start)</w:t>
       </w:r>
     </w:p>
     <w:tbl>
@@ -597,7 +603,19 @@
               <w:jc w:val="left"/>
             </w:pPr>
             <w:r>
-              <w:t xml:space="preserve">Floor, 19/10 at start (extrapolated below 19/12)</w:t>
+              <w:t xml:space="preserve">Applicant’s choice (20 Oct), 19/9 at start, no annuity in 2027</w:t>
+            </w:r>
+          </w:p>
+        </w:tc>
+        <w:tc>
+          <w:tcPr/>
+          <w:p>
+            <w:pPr>
+              <w:pStyle w:val="Compact"/>
+              <w:jc w:val="right"/>
+            </w:pPr>
+            <w:r>
+              <w:t xml:space="preserve">128,183</w:t>
             </w:r>
           </w:p>
         </w:tc>
@@ -645,6 +663,68 @@
               <w:jc w:val="right"/>
             </w:pPr>
             <w:r>
+              <w:t xml:space="preserve">129,757</w:t>
+            </w:r>
+          </w:p>
+        </w:tc>
+      </w:tr>
+      <w:tr>
+        <w:tc>
+          <w:tcPr/>
+          <w:p>
+            <w:pPr>
+              <w:pStyle w:val="Compact"/>
+              <w:jc w:val="left"/>
+            </w:pPr>
+            <w:r>
+              <w:t xml:space="preserve">19/10 at start</w:t>
+            </w:r>
+          </w:p>
+        </w:tc>
+        <w:tc>
+          <w:tcPr/>
+          <w:p>
+            <w:pPr>
+              <w:pStyle w:val="Compact"/>
+              <w:jc w:val="right"/>
+            </w:pPr>
+            <w:r>
+              <w:t xml:space="preserve">129,232</w:t>
+            </w:r>
+          </w:p>
+        </w:tc>
+        <w:tc>
+          <w:tcPr/>
+          <w:p>
+            <w:pPr>
+              <w:pStyle w:val="Compact"/>
+              <w:jc w:val="right"/>
+            </w:pPr>
+            <w:r>
+              <w:t xml:space="preserve">130,281</w:t>
+            </w:r>
+          </w:p>
+        </w:tc>
+        <w:tc>
+          <w:tcPr/>
+          <w:p>
+            <w:pPr>
+              <w:pStyle w:val="Compact"/>
+              <w:jc w:val="right"/>
+            </w:pPr>
+            <w:r>
+              <w:t xml:space="preserve">131,330</w:t>
+            </w:r>
+          </w:p>
+        </w:tc>
+        <w:tc>
+          <w:tcPr/>
+          <w:p>
+            <w:pPr>
+              <w:pStyle w:val="Compact"/>
+              <w:jc w:val="right"/>
+            </w:pPr>
+            <w:r>
               <w:t xml:space="preserve">132,379</w:t>
             </w:r>
           </w:p>
@@ -671,7 +751,7 @@
               <w:jc w:val="left"/>
             </w:pPr>
             <w:r>
-              <w:t xml:space="preserve">Middle, 19/11 at start</w:t>
+              <w:t xml:space="preserve">19/11 at start</w:t>
             </w:r>
           </w:p>
         </w:tc>
@@ -816,31 +896,25 @@
         <w:pStyle w:val="BodyText"/>
       </w:pPr>
       <w:r>
-        <w:t xml:space="preserve">Recommendation. Enter the RGO figure, CHF 132,904. It is the grants office’s own computation,</w:t>
-      </w:r>
-      <w:r>
-        <w:t xml:space="preserve"> </w:t>
-      </w:r>
-      <w:r>
-        <w:t xml:space="preserve">the SNSF asks applicants to enter the maximum and corrects the amount with HR at award, and a</w:t>
-      </w:r>
-      <w:r>
-        <w:t xml:space="preserve"> </w:t>
-      </w:r>
-      <w:r>
-        <w:t xml:space="preserve">lower entry gains nothing. If the applicant prefers to enter what he expects, the middle</w:t>
-      </w:r>
-      <w:r>
-        <w:t xml:space="preserve"> </w:t>
-      </w:r>
-      <w:r>
-        <w:t xml:space="preserve">scenario is the honest point estimate. In all cases mySNF adds the 23% charges itself, about</w:t>
-      </w:r>
-      <w:r>
-        <w:t xml:space="preserve"> </w:t>
-      </w:r>
-      <w:r>
-        <w:t xml:space="preserve">CHF 163,000 per year all-in at the RGO figure.</w:t>
+        <w:t xml:space="preserve">Decision (applicant, 20 Oct). Enter the first row, 19/9 at the start, average CHF 129,757, or</w:t>
+      </w:r>
+      <w:r>
+        <w:t xml:space="preserve"> </w:t>
+      </w:r>
+      <w:r>
+        <w:t xml:space="preserve">the four yearly figures if mySNF asks year by year. This is the cautious reading (2027 annuity</w:t>
+      </w:r>
+      <w:r>
+        <w:t xml:space="preserve"> </w:t>
+      </w:r>
+      <w:r>
+        <w:t xml:space="preserve">not yet voted, no recognition assumed). mySNF adds the 23% charges itself, about CHF 159,600</w:t>
+      </w:r>
+      <w:r>
+        <w:t xml:space="preserve"> </w:t>
+      </w:r>
+      <w:r>
+        <w:t xml:space="preserve">per year all-in. HR confirms the exact amount at award and it can only be higher.</w:t>
       </w:r>
     </w:p>
     <w:bookmarkEnd w:id="22"/>
@@ -1102,7 +1176,681 @@
         <w:pStyle w:val="BodyText"/>
       </w:pPr>
       <w:r>
-        <w:t xml:space="preserve">Scenario A, collaborator at 40% for 48 months.</w:t>
+        <w:t xml:space="preserve">On the categories. An ARE is by definition a student, enrolled in a bachelor or a master and</w:t>
+      </w:r>
+      <w:r>
+        <w:t xml:space="preserve"> </w:t>
+      </w:r>
+      <w:r>
+        <w:t xml:space="preserve">without a master’s degree at hiring, paid at class 6 annuity 0. The class-17 collaborator is a</w:t>
+      </w:r>
+      <w:r>
+        <w:t xml:space="preserve"> </w:t>
+      </w:r>
+      <w:r>
+        <w:t xml:space="preserve">different category (adjoint-e scientifique I or collaborateur/trice scientifique I, PAT or</w:t>
+      </w:r>
+      <w:r>
+        <w:t xml:space="preserve"> </w:t>
+      </w:r>
+      <w:r>
+        <w:t xml:space="preserve">scientific staff), not an ARE. The RGO’s</w:t>
+      </w:r>
+      <w:r>
+        <w:t xml:space="preserve"> </w:t>
+      </w:r>
+      <w:r>
+        <w:t xml:space="preserve">“</w:t>
+      </w:r>
+      <w:r>
+        <w:t xml:space="preserve">ARE at most 40%</w:t>
+      </w:r>
+      <w:r>
+        <w:t xml:space="preserve">”</w:t>
+      </w:r>
+      <w:r>
+        <w:t xml:space="preserve"> </w:t>
+      </w:r>
+      <w:r>
+        <w:t xml:space="preserve">concerns the student only.</w:t>
+      </w:r>
+    </w:p>
+    <w:p>
+      <w:pPr>
+        <w:pStyle w:val="BodyText"/>
+      </w:pPr>
+      <w:r>
+        <w:t xml:space="preserve">Scenario A, the applicant’s choice (20 Oct), fitted under the cap. Collaborator at 40% from M3,</w:t>
+      </w:r>
+      <w:r>
+        <w:t xml:space="preserve"> </w:t>
+      </w:r>
+      <w:r>
+        <w:t xml:space="preserve">when the benchmark starts, to M48, that is 46 months. Master’s student at a minimum, ARE at 10%</w:t>
+      </w:r>
+      <w:r>
+        <w:t xml:space="preserve"> </w:t>
+      </w:r>
+      <w:r>
+        <w:t xml:space="preserve">for the seven benchmark months. Every expense listed.</w:t>
+      </w:r>
+    </w:p>
+    <w:tbl>
+      <w:tblPr>
+        <w:tblStyle w:val="Table"/>
+        <w:tblW w:type="pct" w:w="5000"/>
+        <w:tblLook w:firstRow="1" w:lastRow="0" w:firstColumn="0" w:lastColumn="0" w:noHBand="0" w:noVBand="0" w:val="0020"/>
+        <w:jc w:val="start"/>
+      </w:tblPr>
+      <w:tblGrid>
+        <w:gridCol w:w="2376"/>
+        <w:gridCol w:w="2376"/>
+        <w:gridCol w:w="3168"/>
+      </w:tblGrid>
+      <w:tr>
+        <w:trPr>
+          <w:tblHeader w:val="true"/>
+        </w:trPr>
+        <w:tc>
+          <w:tcPr/>
+          <w:p>
+            <w:pPr>
+              <w:pStyle w:val="Compact"/>
+              <w:jc w:val="left"/>
+            </w:pPr>
+            <w:r>
+              <w:t xml:space="preserve">Line</w:t>
+            </w:r>
+          </w:p>
+        </w:tc>
+        <w:tc>
+          <w:tcPr/>
+          <w:p>
+            <w:pPr>
+              <w:pStyle w:val="Compact"/>
+              <w:jc w:val="left"/>
+            </w:pPr>
+            <w:r>
+              <w:t xml:space="preserve">Detail</w:t>
+            </w:r>
+          </w:p>
+        </w:tc>
+        <w:tc>
+          <w:tcPr/>
+          <w:p>
+            <w:pPr>
+              <w:pStyle w:val="Compact"/>
+              <w:jc w:val="right"/>
+            </w:pPr>
+            <w:r>
+              <w:t xml:space="preserve">CHF</w:t>
+            </w:r>
+          </w:p>
+        </w:tc>
+      </w:tr>
+      <w:tr>
+        <w:tc>
+          <w:tcPr/>
+          <w:p>
+            <w:pPr>
+              <w:pStyle w:val="Compact"/>
+              <w:jc w:val="left"/>
+            </w:pPr>
+            <w:r>
+              <w:t xml:space="preserve">Scientific collaborator, class 17, 40%, M3 to M48 (46 months)</w:t>
+            </w:r>
+          </w:p>
+        </w:tc>
+        <w:tc>
+          <w:tcPr/>
+          <w:p>
+            <w:pPr>
+              <w:pStyle w:val="Compact"/>
+              <w:jc w:val="left"/>
+            </w:pPr>
+            <w:r>
+              <w:t xml:space="preserve">gross 161,000, charges 23%</w:t>
+            </w:r>
+          </w:p>
+        </w:tc>
+        <w:tc>
+          <w:tcPr/>
+          <w:p>
+            <w:pPr>
+              <w:pStyle w:val="Compact"/>
+              <w:jc w:val="right"/>
+            </w:pPr>
+            <w:r>
+              <w:t xml:space="preserve">198,030</w:t>
+            </w:r>
+          </w:p>
+        </w:tc>
+      </w:tr>
+      <w:tr>
+        <w:tc>
+          <w:tcPr/>
+          <w:p>
+            <w:pPr>
+              <w:pStyle w:val="Compact"/>
+              <w:jc w:val="left"/>
+            </w:pPr>
+            <w:r>
+              <w:t xml:space="preserve">Master’s student, ARE 10%, M3 to M9</w:t>
+            </w:r>
+          </w:p>
+        </w:tc>
+        <w:tc>
+          <w:tcPr/>
+          <w:p>
+            <w:pPr>
+              <w:pStyle w:val="Compact"/>
+              <w:jc w:val="left"/>
+            </w:pPr>
+            <w:r>
+              <w:t xml:space="preserve">gross 455 per month, 7 months, charges 23%</w:t>
+            </w:r>
+          </w:p>
+        </w:tc>
+        <w:tc>
+          <w:tcPr/>
+          <w:p>
+            <w:pPr>
+              <w:pStyle w:val="Compact"/>
+              <w:jc w:val="right"/>
+            </w:pPr>
+            <w:r>
+              <w:t xml:space="preserve">3,918</w:t>
+            </w:r>
+          </w:p>
+        </w:tc>
+      </w:tr>
+      <w:tr>
+        <w:tc>
+          <w:tcPr/>
+          <w:p>
+            <w:pPr>
+              <w:pStyle w:val="Compact"/>
+              <w:jc w:val="left"/>
+            </w:pPr>
+            <w:r>
+              <w:t xml:space="preserve">Conferences</w:t>
+            </w:r>
+          </w:p>
+        </w:tc>
+        <w:tc>
+          <w:tcPr/>
+          <w:p>
+            <w:pPr>
+              <w:pStyle w:val="Compact"/>
+              <w:jc w:val="left"/>
+            </w:pPr>
+            <w:r>
+              <w:t xml:space="preserve">8 European at 2,000 (fee, travel, three nights) and 1 overseas at 4,000</w:t>
+            </w:r>
+          </w:p>
+        </w:tc>
+        <w:tc>
+          <w:tcPr/>
+          <w:p>
+            <w:pPr>
+              <w:pStyle w:val="Compact"/>
+              <w:jc w:val="right"/>
+            </w:pPr>
+            <w:r>
+              <w:t xml:space="preserve">20,000</w:t>
+            </w:r>
+          </w:p>
+        </w:tc>
+      </w:tr>
+      <w:tr>
+        <w:tc>
+          <w:tcPr/>
+          <w:p>
+            <w:pPr>
+              <w:pStyle w:val="Compact"/>
+              <w:jc w:val="left"/>
+            </w:pPr>
+            <w:r>
+              <w:t xml:space="preserve">Short stays abroad</w:t>
+            </w:r>
+          </w:p>
+        </w:tc>
+        <w:tc>
+          <w:tcPr/>
+          <w:p>
+            <w:pPr>
+              <w:pStyle w:val="Compact"/>
+              <w:jc w:val="left"/>
+            </w:pPr>
+            <w:r>
+              <w:t xml:space="preserve">two stays of one to two weeks with forecasting groups, at 3,000</w:t>
+            </w:r>
+          </w:p>
+        </w:tc>
+        <w:tc>
+          <w:tcPr/>
+          <w:p>
+            <w:pPr>
+              <w:pStyle w:val="Compact"/>
+              <w:jc w:val="right"/>
+            </w:pPr>
+            <w:r>
+              <w:t xml:space="preserve">6,000</w:t>
+            </w:r>
+          </w:p>
+        </w:tc>
+      </w:tr>
+      <w:tr>
+        <w:tc>
+          <w:tcPr/>
+          <w:p>
+            <w:pPr>
+              <w:pStyle w:val="Compact"/>
+              <w:jc w:val="left"/>
+            </w:pPr>
+            <w:r>
+              <w:t xml:space="preserve">Visiting researchers</w:t>
+            </w:r>
+          </w:p>
+        </w:tc>
+        <w:tc>
+          <w:tcPr/>
+          <w:p>
+            <w:pPr>
+              <w:pStyle w:val="Compact"/>
+              <w:jc w:val="left"/>
+            </w:pPr>
+            <w:r>
+              <w:t xml:space="preserve">two incoming visitors hosted in Geneva, at 1,500</w:t>
+            </w:r>
+          </w:p>
+        </w:tc>
+        <w:tc>
+          <w:tcPr/>
+          <w:p>
+            <w:pPr>
+              <w:pStyle w:val="Compact"/>
+              <w:jc w:val="right"/>
+            </w:pPr>
+            <w:r>
+              <w:t xml:space="preserve">3,000</w:t>
+            </w:r>
+          </w:p>
+        </w:tc>
+      </w:tr>
+      <w:tr>
+        <w:tc>
+          <w:tcPr/>
+          <w:p>
+            <w:pPr>
+              <w:pStyle w:val="Compact"/>
+              <w:jc w:val="left"/>
+            </w:pPr>
+            <w:r>
+              <w:t xml:space="preserve">Workshops</w:t>
+            </w:r>
+          </w:p>
+        </w:tc>
+        <w:tc>
+          <w:tcPr/>
+          <w:p>
+            <w:pPr>
+              <w:pStyle w:val="Compact"/>
+              <w:jc w:val="left"/>
+            </w:pPr>
+            <w:r>
+              <w:t xml:space="preserve">elicitation workshop with the services (WP4) and final briefing, at 1,000</w:t>
+            </w:r>
+          </w:p>
+        </w:tc>
+        <w:tc>
+          <w:tcPr/>
+          <w:p>
+            <w:pPr>
+              <w:pStyle w:val="Compact"/>
+              <w:jc w:val="right"/>
+            </w:pPr>
+            <w:r>
+              <w:t xml:space="preserve">2,000</w:t>
+            </w:r>
+          </w:p>
+        </w:tc>
+      </w:tr>
+      <w:tr>
+        <w:tc>
+          <w:tcPr/>
+          <w:p>
+            <w:pPr>
+              <w:pStyle w:val="Compact"/>
+              <w:jc w:val="left"/>
+            </w:pPr>
+            <w:r>
+              <w:t xml:space="preserve">IT services, database</w:t>
+            </w:r>
+          </w:p>
+        </w:tc>
+        <w:tc>
+          <w:tcPr/>
+          <w:p>
+            <w:pPr>
+              <w:pStyle w:val="Compact"/>
+              <w:jc w:val="left"/>
+            </w:pPr>
+            <w:r>
+              <w:t xml:space="preserve">project database and secure-environment runs with UNIGE IT, about eight developer days</w:t>
+            </w:r>
+          </w:p>
+        </w:tc>
+        <w:tc>
+          <w:tcPr/>
+          <w:p>
+            <w:pPr>
+              <w:pStyle w:val="Compact"/>
+              <w:jc w:val="right"/>
+            </w:pPr>
+            <w:r>
+              <w:t xml:space="preserve">8,000</w:t>
+            </w:r>
+          </w:p>
+        </w:tc>
+      </w:tr>
+      <w:tr>
+        <w:tc>
+          <w:tcPr/>
+          <w:p>
+            <w:pPr>
+              <w:pStyle w:val="Compact"/>
+              <w:jc w:val="left"/>
+            </w:pPr>
+            <w:r>
+              <w:t xml:space="preserve">IT services, dashboard</w:t>
+            </w:r>
+          </w:p>
+        </w:tc>
+        <w:tc>
+          <w:tcPr/>
+          <w:p>
+            <w:pPr>
+              <w:pStyle w:val="Compact"/>
+              <w:jc w:val="left"/>
+            </w:pPr>
+            <w:r>
+              <w:t xml:space="preserve">small hosted instance for observation mode, two years at 1,200</w:t>
+            </w:r>
+          </w:p>
+        </w:tc>
+        <w:tc>
+          <w:tcPr/>
+          <w:p>
+            <w:pPr>
+              <w:pStyle w:val="Compact"/>
+              <w:jc w:val="right"/>
+            </w:pPr>
+            <w:r>
+              <w:t xml:space="preserve">2,400</w:t>
+            </w:r>
+          </w:p>
+        </w:tc>
+      </w:tr>
+      <w:tr>
+        <w:tc>
+          <w:tcPr/>
+          <w:p>
+            <w:pPr>
+              <w:pStyle w:val="Compact"/>
+              <w:jc w:val="left"/>
+            </w:pPr>
+            <w:r>
+              <w:t xml:space="preserve">Open research data</w:t>
+            </w:r>
+          </w:p>
+        </w:tc>
+        <w:tc>
+          <w:tcPr/>
+          <w:p>
+            <w:pPr>
+              <w:pStyle w:val="Compact"/>
+              <w:jc w:val="left"/>
+            </w:pPr>
+            <w:r>
+              <w:t xml:space="preserve">deposit and curation of the benchmark, code and evaluation outputs</w:t>
+            </w:r>
+          </w:p>
+        </w:tc>
+        <w:tc>
+          <w:tcPr/>
+          <w:p>
+            <w:pPr>
+              <w:pStyle w:val="Compact"/>
+              <w:jc w:val="right"/>
+            </w:pPr>
+            <w:r>
+              <w:t xml:space="preserve">2,000</w:t>
+            </w:r>
+          </w:p>
+        </w:tc>
+      </w:tr>
+      <w:tr>
+        <w:tc>
+          <w:tcPr/>
+          <w:p>
+            <w:pPr>
+              <w:pStyle w:val="Compact"/>
+              <w:jc w:val="left"/>
+            </w:pPr>
+            <w:r>
+              <w:t xml:space="preserve">Data access</w:t>
+            </w:r>
+          </w:p>
+        </w:tc>
+        <w:tc>
+          <w:tcPr/>
+          <w:p>
+            <w:pPr>
+              <w:pStyle w:val="Compact"/>
+              <w:jc w:val="left"/>
+            </w:pPr>
+            <w:r>
+              <w:t xml:space="preserve">HUG data-office extraction and preparation of the emergency series (to confirm)</w:t>
+            </w:r>
+          </w:p>
+        </w:tc>
+        <w:tc>
+          <w:tcPr/>
+          <w:p>
+            <w:pPr>
+              <w:pStyle w:val="Compact"/>
+              <w:jc w:val="right"/>
+            </w:pPr>
+            <w:r>
+              <w:t xml:space="preserve">3,000</w:t>
+            </w:r>
+          </w:p>
+        </w:tc>
+      </w:tr>
+      <w:tr>
+        <w:tc>
+          <w:tcPr/>
+          <w:p>
+            <w:pPr>
+              <w:pStyle w:val="Compact"/>
+              <w:jc w:val="left"/>
+            </w:pPr>
+            <w:r>
+              <w:t xml:space="preserve">Regulatory fees</w:t>
+            </w:r>
+          </w:p>
+        </w:tc>
+        <w:tc>
+          <w:tcPr/>
+          <w:p>
+            <w:pPr>
+              <w:pStyle w:val="Compact"/>
+              <w:jc w:val="left"/>
+            </w:pPr>
+            <w:r>
+              <w:t xml:space="preserve">ethics commission fees for the Art. 34 submission</w:t>
+            </w:r>
+          </w:p>
+        </w:tc>
+        <w:tc>
+          <w:tcPr/>
+          <w:p>
+            <w:pPr>
+              <w:pStyle w:val="Compact"/>
+              <w:jc w:val="right"/>
+            </w:pPr>
+            <w:r>
+              <w:t xml:space="preserve">1,500</w:t>
+            </w:r>
+          </w:p>
+        </w:tc>
+      </w:tr>
+      <w:tr>
+        <w:tc>
+          <w:tcPr/>
+          <w:p>
+            <w:pPr>
+              <w:pStyle w:val="Compact"/>
+              <w:jc w:val="left"/>
+            </w:pPr>
+            <w:r>
+              <w:t xml:space="preserve">Total</w:t>
+            </w:r>
+          </w:p>
+        </w:tc>
+        <w:tc>
+          <w:tcPr/>
+          <w:p>
+            <w:pPr>
+              <w:pStyle w:val="Compact"/>
+            </w:pPr>
+          </w:p>
+        </w:tc>
+        <w:tc>
+          <w:tcPr/>
+          <w:p>
+            <w:pPr>
+              <w:pStyle w:val="Compact"/>
+              <w:jc w:val="right"/>
+            </w:pPr>
+            <w:r>
+              <w:t xml:space="preserve">249,848</w:t>
+            </w:r>
+          </w:p>
+        </w:tc>
+      </w:tr>
+      <w:tr>
+        <w:tc>
+          <w:tcPr/>
+          <w:p>
+            <w:pPr>
+              <w:pStyle w:val="Compact"/>
+              <w:jc w:val="left"/>
+            </w:pPr>
+            <w:r>
+              <w:t xml:space="preserve">Headroom under CHF 250,000</w:t>
+            </w:r>
+          </w:p>
+        </w:tc>
+        <w:tc>
+          <w:tcPr/>
+          <w:p>
+            <w:pPr>
+              <w:pStyle w:val="Compact"/>
+            </w:pPr>
+          </w:p>
+        </w:tc>
+        <w:tc>
+          <w:tcPr/>
+          <w:p>
+            <w:pPr>
+              <w:pStyle w:val="Compact"/>
+              <w:jc w:val="right"/>
+            </w:pPr>
+            <w:r>
+              <w:t xml:space="preserve">152</w:t>
+            </w:r>
+          </w:p>
+        </w:tc>
+      </w:tr>
+    </w:tbl>
+    <w:p>
+      <w:pPr>
+        <w:pStyle w:val="BodyText"/>
+      </w:pPr>
+      <w:r>
+        <w:t xml:space="preserve">Adjustment rule, since the class-17 gross is an assumption. Each CHF 5,000 of gross at 100%</w:t>
+      </w:r>
+      <w:r>
+        <w:t xml:space="preserve"> </w:t>
+      </w:r>
+      <w:r>
+        <w:t xml:space="preserve">above 105,000 adds about 9,430 to the collaborator line. Cut in this order until the total is</w:t>
+      </w:r>
+      <w:r>
+        <w:t xml:space="preserve"> </w:t>
+      </w:r>
+      <w:r>
+        <w:t xml:space="preserve">back under the cap. The overseas conference (4,000), one short stay (3,000), the HUG fee line</w:t>
+      </w:r>
+      <w:r>
+        <w:t xml:space="preserve"> </w:t>
+      </w:r>
+      <w:r>
+        <w:t xml:space="preserve">(3,000), one visitor (1,500), then shorten the collaborator by one month (about 4,300 per</w:t>
+      </w:r>
+      <w:r>
+        <w:t xml:space="preserve"> </w:t>
+      </w:r>
+      <w:r>
+        <w:t xml:space="preserve">month). If the gross is below 105,000, add back in the reverse order, then raise the student to</w:t>
+      </w:r>
+      <w:r>
+        <w:t xml:space="preserve"> </w:t>
+      </w:r>
+      <w:r>
+        <w:t xml:space="preserve">20% (about 3,900 more).</w:t>
+      </w:r>
+    </w:p>
+    <w:p>
+      <w:pPr>
+        <w:pStyle w:val="BodyText"/>
+      </w:pPr>
+      <w:r>
+        <w:t xml:space="preserve">On the master’s student. Paying a minimum is the right call. The thesis itself is academic work</w:t>
+      </w:r>
+      <w:r>
+        <w:t xml:space="preserve"> </w:t>
+      </w:r>
+      <w:r>
+        <w:t xml:space="preserve">and is not paid, the ARE contract at 10% (about four hours a week) recognises the extraction</w:t>
+      </w:r>
+      <w:r>
+        <w:t xml:space="preserve"> </w:t>
+      </w:r>
+      <w:r>
+        <w:t xml:space="preserve">work on the benchmark, keeps the student inside the University’s rules and costs under 4,000.</w:t>
+      </w:r>
+      <w:r>
+        <w:t xml:space="preserve"> </w:t>
+      </w:r>
+      <w:r>
+        <w:t xml:space="preserve">If the student, not the collaborator, is to be the second extractor of T1.2, raise to 20% for</w:t>
+      </w:r>
+      <w:r>
+        <w:t xml:space="preserve"> </w:t>
+      </w:r>
+      <w:r>
+        <w:t xml:space="preserve">the seven months (7,835 with charges) and cut the overseas conference.</w:t>
+      </w:r>
+    </w:p>
+    <w:p>
+      <w:pPr>
+        <w:pStyle w:val="BodyText"/>
+      </w:pPr>
+      <w:r>
+        <w:t xml:space="preserve">Scenario A as first asked, 40% for 48 months from M1, for the record.</w:t>
       </w:r>
     </w:p>
     <w:tbl>
@@ -1205,31 +1953,31 @@
               <w:jc w:val="left"/>
             </w:pPr>
             <w:r>
-              <w:t xml:space="preserve">ARE at 40%, 7 months (second extractor, M3 to M9)</w:t>
-            </w:r>
-          </w:p>
-        </w:tc>
-        <w:tc>
-          <w:tcPr/>
-          <w:p>
-            <w:pPr>
-              <w:pStyle w:val="Compact"/>
-              <w:jc w:val="right"/>
-            </w:pPr>
-            <w:r>
-              <w:t xml:space="preserve">12,740</w:t>
-            </w:r>
-          </w:p>
-        </w:tc>
-        <w:tc>
-          <w:tcPr/>
-          <w:p>
-            <w:pPr>
-              <w:pStyle w:val="Compact"/>
-              <w:jc w:val="right"/>
-            </w:pPr>
-            <w:r>
-              <w:t xml:space="preserve">15,670</w:t>
+              <w:t xml:space="preserve">ARE at 10%, 7 months</w:t>
+            </w:r>
+          </w:p>
+        </w:tc>
+        <w:tc>
+          <w:tcPr/>
+          <w:p>
+            <w:pPr>
+              <w:pStyle w:val="Compact"/>
+              <w:jc w:val="right"/>
+            </w:pPr>
+            <w:r>
+              <w:t xml:space="preserve">3,185</w:t>
+            </w:r>
+          </w:p>
+        </w:tc>
+        <w:tc>
+          <w:tcPr/>
+          <w:p>
+            <w:pPr>
+              <w:pStyle w:val="Compact"/>
+              <w:jc w:val="right"/>
+            </w:pPr>
+            <w:r>
+              <w:t xml:space="preserve">3,918</w:t>
             </w:r>
           </w:p>
         </w:tc>
@@ -1263,7 +2011,7 @@
               <w:jc w:val="right"/>
             </w:pPr>
             <w:r>
-              <w:t xml:space="preserve">222,310</w:t>
+              <w:t xml:space="preserve">210,558</w:t>
             </w:r>
           </w:p>
         </w:tc>
@@ -1274,7 +2022,21 @@
         <w:pStyle w:val="BodyText"/>
       </w:pPr>
       <w:r>
-        <w:t xml:space="preserve">Scenario B, collaborator at 40% for 7 months, then 20% for 36 months.</w:t>
+        <w:t xml:space="preserve">With the other lines above (47,900) it reaches 258,458, over the cap by about 8,500. Starting</w:t>
+      </w:r>
+      <w:r>
+        <w:t xml:space="preserve"> </w:t>
+      </w:r>
+      <w:r>
+        <w:t xml:space="preserve">the hire at M3, where the plan places the benchmark, is what makes it fit.</w:t>
+      </w:r>
+    </w:p>
+    <w:p>
+      <w:pPr>
+        <w:pStyle w:val="BodyText"/>
+      </w:pPr>
+      <w:r>
+        <w:t xml:space="preserve">Scenario B, for reference, collaborator at 40% for 7 months, then 20% for 36 months.</w:t>
       </w:r>
     </w:p>
     <w:tbl>
@@ -1480,13 +2242,13 @@
       </w:tr>
     </w:tbl>
     <w:bookmarkEnd w:id="24"/>
-    <w:bookmarkStart w:id="25" w:name="Xf929ae64515fffb6075e3753150015d234d13e5"/>
+    <w:bookmarkStart w:id="25" w:name="Xfd4fffc74474d0d6baa13e02d8be4e935aaac4c"/>
     <w:p>
       <w:pPr>
         <w:pStyle w:val="Heading3"/>
       </w:pPr>
       <w:r>
-        <w:t xml:space="preserve">Other lines (assumed amounts, same in both scenarios)</w:t>
+        <w:t xml:space="preserve">Other lines as first drafted (before the fit, for reference)</w:t>
       </w:r>
     </w:p>
     <w:tbl>
@@ -1981,7 +2743,7 @@
               <w:jc w:val="right"/>
             </w:pPr>
             <w:r>
-              <w:t xml:space="preserve">Scenario A</w:t>
+              <w:t xml:space="preserve">Scenario A fitted (M3 to M48)</w:t>
             </w:r>
           </w:p>
         </w:tc>
@@ -2007,19 +2769,19 @@
               <w:jc w:val="left"/>
             </w:pPr>
             <w:r>
-              <w:t xml:space="preserve">Staff</w:t>
-            </w:r>
-          </w:p>
-        </w:tc>
-        <w:tc>
-          <w:tcPr/>
-          <w:p>
-            <w:pPr>
-              <w:pStyle w:val="Compact"/>
-              <w:jc w:val="right"/>
-            </w:pPr>
-            <w:r>
-              <w:t xml:space="preserve">222,310</w:t>
+              <w:t xml:space="preserve">Staff including the student</w:t>
+            </w:r>
+          </w:p>
+        </w:tc>
+        <w:tc>
+          <w:tcPr/>
+          <w:p>
+            <w:pPr>
+              <w:pStyle w:val="Compact"/>
+              <w:jc w:val="right"/>
+            </w:pPr>
+            <w:r>
+              <w:t xml:space="preserve">201,948</w:t>
             </w:r>
           </w:p>
         </w:tc>
@@ -2057,22 +2819,22 @@
               <w:jc w:val="right"/>
             </w:pPr>
             <w:r>
+              <w:t xml:space="preserve">47,900</w:t>
+            </w:r>
+          </w:p>
+        </w:tc>
+        <w:tc>
+          <w:tcPr/>
+          <w:p>
+            <w:pPr>
+              <w:pStyle w:val="Compact"/>
+              <w:jc w:val="right"/>
+            </w:pPr>
+            <w:r>
               <w:t xml:space="preserve">56,900</w:t>
             </w:r>
           </w:p>
         </w:tc>
-        <w:tc>
-          <w:tcPr/>
-          <w:p>
-            <w:pPr>
-              <w:pStyle w:val="Compact"/>
-              <w:jc w:val="right"/>
-            </w:pPr>
-            <w:r>
-              <w:t xml:space="preserve">56,900</w:t>
-            </w:r>
-          </w:p>
-        </w:tc>
       </w:tr>
       <w:tr>
         <w:tc>
@@ -2095,7 +2857,7 @@
               <w:jc w:val="right"/>
             </w:pPr>
             <w:r>
-              <w:t xml:space="preserve">279,210</w:t>
+              <w:t xml:space="preserve">249,848</w:t>
             </w:r>
           </w:p>
         </w:tc>
@@ -2133,7 +2895,7 @@
               <w:jc w:val="right"/>
             </w:pPr>
             <w:r>
-              <w:t xml:space="preserve">over by 29,210</w:t>
+              <w:t xml:space="preserve">under by 152</w:t>
             </w:r>
           </w:p>
         </w:tc>
@@ -2156,53 +2918,13 @@
         <w:pStyle w:val="BodyText"/>
       </w:pPr>
       <w:r>
-        <w:t xml:space="preserve">Scenario A does not fit at the assumed class-17 rate. It would fit only if the collaborator’s</w:t>
-      </w:r>
-      <w:r>
-        <w:t xml:space="preserve"> </w:t>
-      </w:r>
-      <w:r>
-        <w:t xml:space="preserve">gross is at most about CHF 90,000 at 100%, or if the other lines are cut to about CHF 27,000</w:t>
-      </w:r>
-      <w:r>
-        <w:t xml:space="preserve"> </w:t>
-      </w:r>
-      <w:r>
-        <w:t xml:space="preserve">(no overseas conference, no visitors, half the IT line, no data or regulatory fees).</w:t>
-      </w:r>
-    </w:p>
-    <w:p>
-      <w:pPr>
-        <w:pStyle w:val="BodyText"/>
-      </w:pPr>
-      <w:r>
-        <w:t xml:space="preserve">Scenario B fits with room. The headroom of about CHF 70,000 could raise the collaborator to 30%</w:t>
-      </w:r>
-      <w:r>
-        <w:t xml:space="preserve"> </w:t>
-      </w:r>
-      <w:r>
-        <w:t xml:space="preserve">in years 2 to 4 (adds about 38,700) or extend the 40% to the full first year (M3 to M14, adds</w:t>
-      </w:r>
-      <w:r>
-        <w:t xml:space="preserve"> </w:t>
-      </w:r>
-      <w:r>
-        <w:t xml:space="preserve">about 10,800), while staying under the cap.</w:t>
-      </w:r>
-    </w:p>
-    <w:p>
-      <w:pPr>
-        <w:pStyle w:val="BodyText"/>
-      </w:pPr>
-      <w:r>
-        <w:t xml:space="preserve">Sensitivity. Each CHF 10,000 of difference in the class-17 gross at 100% moves scenario A by</w:t>
-      </w:r>
-      <w:r>
-        <w:t xml:space="preserve"> </w:t>
-      </w:r>
-      <w:r>
-        <w:t xml:space="preserve">about 19,700 and scenario B by about 10,200.</w:t>
+        <w:t xml:space="preserve">The applicant chose scenario A (20 Oct). Scenario B stays here as the fallback if the RGO</w:t>
+      </w:r>
+      <w:r>
+        <w:t xml:space="preserve"> </w:t>
+      </w:r>
+      <w:r>
+        <w:t xml:space="preserve">returns a class-17 gross well above 105,000.</w:t>
       </w:r>
     </w:p>
     <w:bookmarkEnd w:id="26"/>
@@ -2221,19 +2943,25 @@
         <w:pStyle w:val="FirstParagraph"/>
       </w:pPr>
       <w:r>
-        <w:t xml:space="preserve">Staff, scientific collaborator (class 17, part-time). Supports the labour-intensive specified</w:t>
-      </w:r>
-      <w:r>
-        <w:t xml:space="preserve"> </w:t>
-      </w:r>
-      <w:r>
-        <w:t xml:space="preserve">work. Second extraction arm of the manual benchmark in T1.2 (M3 to M9), then data handling,</w:t>
-      </w:r>
-      <w:r>
-        <w:t xml:space="preserve"> </w:t>
-      </w:r>
-      <w:r>
-        <w:t xml:space="preserve">the rolling replay pipeline of WP3 and reproducibility of the evaluation code. The scientific</w:t>
+        <w:t xml:space="preserve">Staff, scientific collaborator (class 17, 40%, M3 to M48). Supports the labour-intensive</w:t>
+      </w:r>
+      <w:r>
+        <w:t xml:space="preserve"> </w:t>
+      </w:r>
+      <w:r>
+        <w:t xml:space="preserve">specified work. Second extraction arm of the manual benchmark in T1.2 (M3 to M9), then data</w:t>
+      </w:r>
+      <w:r>
+        <w:t xml:space="preserve"> </w:t>
+      </w:r>
+      <w:r>
+        <w:t xml:space="preserve">handling, the rolling replay pipeline of WP3, the dashboard runs and reproducibility of the</w:t>
+      </w:r>
+      <w:r>
+        <w:t xml:space="preserve"> </w:t>
+      </w:r>
+      <w:r>
+        <w:t xml:space="preserve">evaluation code. The scientific</w:t>
       </w:r>
       <w:r>
         <w:t xml:space="preserve"> </w:t>
@@ -2253,19 +2981,19 @@
         <w:pStyle w:val="BodyText"/>
       </w:pPr>
       <w:r>
-        <w:t xml:space="preserve">Staff, master’s student (ARE). Second independent extractor for the T1.2 benchmark, seven months</w:t>
-      </w:r>
-      <w:r>
-        <w:t xml:space="preserve"> </w:t>
-      </w:r>
-      <w:r>
-        <w:t xml:space="preserve">at 40%, under the registered extraction protocol (plan 2.3.3, T1.2). Hired through the</w:t>
-      </w:r>
-      <w:r>
-        <w:t xml:space="preserve"> </w:t>
-      </w:r>
-      <w:r>
-        <w:t xml:space="preserve">University’s ARE scheme.</w:t>
+        <w:t xml:space="preserve">Staff, master’s student (ARE, 10%, M3 to M9). Assists the manual extraction for the T1.2</w:t>
+      </w:r>
+      <w:r>
+        <w:t xml:space="preserve"> </w:t>
+      </w:r>
+      <w:r>
+        <w:t xml:space="preserve">benchmark under the registered protocol, alongside a master’s thesis on the project (plan 2.3.3,</w:t>
+      </w:r>
+      <w:r>
+        <w:t xml:space="preserve"> </w:t>
+      </w:r>
+      <w:r>
+        <w:t xml:space="preserve">T1.2). Hired through the University’s ARE scheme at the student rate.</w:t>
       </w:r>
     </w:p>
     <w:p>
@@ -2692,6 +3420,36 @@
       </w:r>
       <w:r>
         <w:t xml:space="preserve">collaborator.</w:t>
+      </w:r>
+    </w:p>
+    <w:p>
+      <w:pPr>
+        <w:numPr>
+          <w:ilvl w:val="0"/>
+          <w:numId w:val="1004"/>
+        </w:numPr>
+        <w:pStyle w:val="Compact"/>
+      </w:pPr>
+      <w:r>
+        <w:t xml:space="preserve">20 Oct, later. Applicant: enter 19/9 at the start (no 2027 annuity assumed), scenario A</w:t>
+      </w:r>
+      <w:r>
+        <w:t xml:space="preserve"> </w:t>
+      </w:r>
+      <w:r>
+        <w:t xml:space="preserve">preferred but never over the cap and without dropping much, all expenses listed, the</w:t>
+      </w:r>
+      <w:r>
+        <w:t xml:space="preserve"> </w:t>
+      </w:r>
+      <w:r>
+        <w:t xml:space="preserve">collaborator is class 17, question whether to pay the master’s student a minimum. Answer: yes,</w:t>
+      </w:r>
+      <w:r>
+        <w:t xml:space="preserve"> </w:t>
+      </w:r>
+      <w:r>
+        <w:t xml:space="preserve">ARE at 10% for seven months. Fitted by starting the hire at M3.</w:t>
       </w:r>
     </w:p>
     <w:p>

</xml_diff>